<commit_message>
style(task 701 insulin): implemented Ina's changes to case document which improved formatting and clarity
</commit_message>
<xml_diff>
--- a/Tasks/Task_701_insulin_synthesis/Short_notes_Task_701_insulin_synthesis.docx
+++ b/Tasks/Task_701_insulin_synthesis/Short_notes_Task_701_insulin_synthesis.docx
@@ -1,6 +1,6 @@
 
 <file path=word/document.xml><?xml version="1.0" encoding="utf-8"?>
-<w:document xmlns:wpc="http://schemas.microsoft.com/office/word/2010/wordprocessingCanvas" xmlns:cx="http://schemas.microsoft.com/office/drawing/2014/chartex" xmlns:cx1="http://schemas.microsoft.com/office/drawing/2015/9/8/chartex" xmlns:cx2="http://schemas.microsoft.com/office/drawing/2015/10/21/chartex" xmlns:cx3="http://schemas.microsoft.com/office/drawing/2016/5/9/chartex" xmlns:cx4="http://schemas.microsoft.com/office/drawing/2016/5/10/chartex" xmlns:cx5="http://schemas.microsoft.com/office/drawing/2016/5/11/chartex" xmlns:cx6="http://schemas.microsoft.com/office/drawing/2016/5/12/chartex" xmlns:cx7="http://schemas.microsoft.com/office/drawing/2016/5/13/chartex" xmlns:cx8="http://schemas.microsoft.com/office/drawing/2016/5/14/chartex" xmlns:mc="http://schemas.openxmlformats.org/markup-compatibility/2006" xmlns:aink="http://schemas.microsoft.com/office/drawing/2016/ink" xmlns:am3d="http://schemas.microsoft.com/office/drawing/2017/model3d" xmlns:o="urn:schemas-microsoft-com:office:office" xmlns:oel="http://schemas.microsoft.com/office/2019/extlst" xmlns:r="http://schemas.openxmlformats.org/officeDocument/2006/relationships" xmlns:m="http://schemas.openxmlformats.org/officeDocument/2006/math" xmlns:v="urn:schemas-microsoft-com:vml" xmlns:wp14="http://schemas.microsoft.com/office/word/2010/wordprocessingDrawing" xmlns:wp="http://schemas.openxmlformats.org/drawingml/2006/wordprocessingDrawing" xmlns:w10="urn:schemas-microsoft-com:office:word" xmlns:w="http://schemas.openxmlformats.org/wordprocessingml/2006/main" xmlns:w14="http://schemas.microsoft.com/office/word/2010/wordml" xmlns:w15="http://schemas.microsoft.com/office/word/2012/wordml" xmlns:w16cex="http://schemas.microsoft.com/office/word/2018/wordml/cex" xmlns:w16cid="http://schemas.microsoft.com/office/word/2016/wordml/cid" xmlns:w16="http://schemas.microsoft.com/office/word/2018/wordml" xmlns:w16du="http://schemas.microsoft.com/office/word/2023/wordml/word16du" xmlns:w16sdtdh="http://schemas.microsoft.com/office/word/2020/wordml/sdtdatahash" xmlns:w16se="http://schemas.microsoft.com/office/word/2015/wordml/symex" xmlns:wpg="http://schemas.microsoft.com/office/word/2010/wordprocessingGroup" xmlns:wpi="http://schemas.microsoft.com/office/word/2010/wordprocessingInk" xmlns:wne="http://schemas.microsoft.com/office/word/2006/wordml" xmlns:wps="http://schemas.microsoft.com/office/word/2010/wordprocessingShape" mc:Ignorable="w14 w15 w16se w16cid w16 w16cex w16sdtdh w16du wp14">
+<w:document xmlns:wpc="http://schemas.microsoft.com/office/word/2010/wordprocessingCanvas" xmlns:cx="http://schemas.microsoft.com/office/drawing/2014/chartex" xmlns:cx1="http://schemas.microsoft.com/office/drawing/2015/9/8/chartex" xmlns:cx2="http://schemas.microsoft.com/office/drawing/2015/10/21/chartex" xmlns:cx3="http://schemas.microsoft.com/office/drawing/2016/5/9/chartex" xmlns:cx4="http://schemas.microsoft.com/office/drawing/2016/5/10/chartex" xmlns:cx5="http://schemas.microsoft.com/office/drawing/2016/5/11/chartex" xmlns:cx6="http://schemas.microsoft.com/office/drawing/2016/5/12/chartex" xmlns:cx7="http://schemas.microsoft.com/office/drawing/2016/5/13/chartex" xmlns:cx8="http://schemas.microsoft.com/office/drawing/2016/5/14/chartex" xmlns:mc="http://schemas.openxmlformats.org/markup-compatibility/2006" xmlns:aink="http://schemas.microsoft.com/office/drawing/2016/ink" xmlns:am3d="http://schemas.microsoft.com/office/drawing/2017/model3d" xmlns:o="urn:schemas-microsoft-com:office:office" xmlns:oel="http://schemas.microsoft.com/office/2019/extlst" xmlns:r="http://schemas.openxmlformats.org/officeDocument/2006/relationships" xmlns:m="http://schemas.openxmlformats.org/officeDocument/2006/math" xmlns:v="urn:schemas-microsoft-com:vml" xmlns:wp14="http://schemas.microsoft.com/office/word/2010/wordprocessingDrawing" xmlns:wp="http://schemas.openxmlformats.org/drawingml/2006/wordprocessingDrawing" xmlns:w10="urn:schemas-microsoft-com:office:word" xmlns:w="http://schemas.openxmlformats.org/wordprocessingml/2006/main" xmlns:w14="http://schemas.microsoft.com/office/word/2010/wordml" xmlns:w15="http://schemas.microsoft.com/office/word/2012/wordml" xmlns:w16cex="http://schemas.microsoft.com/office/word/2018/wordml/cex" xmlns:w16cid="http://schemas.microsoft.com/office/word/2016/wordml/cid" xmlns:w16="http://schemas.microsoft.com/office/word/2018/wordml" xmlns:w16du="http://schemas.microsoft.com/office/word/2023/wordml/word16du" xmlns:w16sdtdh="http://schemas.microsoft.com/office/word/2020/wordml/sdtdatahash" xmlns:w16sdtfl="http://schemas.microsoft.com/office/word/2024/wordml/sdtformatlock" xmlns:w16se="http://schemas.microsoft.com/office/word/2015/wordml/symex" xmlns:wpg="http://schemas.microsoft.com/office/word/2010/wordprocessingGroup" xmlns:wpi="http://schemas.microsoft.com/office/word/2010/wordprocessingInk" xmlns:wne="http://schemas.microsoft.com/office/word/2006/wordml" xmlns:wps="http://schemas.microsoft.com/office/word/2010/wordprocessingShape" mc:Ignorable="w14 w15 w16se w16cid w16 w16cex w16sdtdh w16sdtfl w16du wp14">
   <w:body>
     <w:p>
       <w:r>
@@ -16,13 +16,8 @@
         </w:numPr>
       </w:pPr>
       <w:r>
-        <w:t xml:space="preserve">Includes H202 production through PDIA1disulfide bond creation and regeneration through ERO1 which turns 2 O2 into </w:t>
-      </w:r>
-      <w:proofErr w:type="gramStart"/>
-      <w:r>
-        <w:t>2H2O2</w:t>
-      </w:r>
-      <w:proofErr w:type="gramEnd"/>
+        <w:t>Includes H202 production through PDIA1disulfide bond creation and regeneration through ERO1 which turns 2 O2 into 2H2O2</w:t>
+      </w:r>
     </w:p>
     <w:p>
       <w:pPr>
@@ -33,13 +28,8 @@
         </w:numPr>
       </w:pPr>
       <w:r>
-        <w:t xml:space="preserve">SEC12 is important for COPII coat formation with pro-insulin, however on knockout this leads to aggregation of pro-insulin and other proteins which then lead to </w:t>
-      </w:r>
-      <w:proofErr w:type="gramStart"/>
-      <w:r>
-        <w:t>misfolding</w:t>
-      </w:r>
-      <w:proofErr w:type="gramEnd"/>
+        <w:t>SEC12 is important for COPII coat formation with pro-insulin, however on knockout this leads to aggregation of pro-insulin and other proteins which then lead to misfolding</w:t>
+      </w:r>
     </w:p>
     <w:p>
       <w:pPr>
@@ -50,15 +40,7 @@
         </w:numPr>
       </w:pPr>
       <w:r>
-        <w:t xml:space="preserve">Sec62-depndent SRP recognition also </w:t>
-      </w:r>
-      <w:proofErr w:type="gramStart"/>
-      <w:r>
-        <w:t>exists, and</w:t>
-      </w:r>
-      <w:proofErr w:type="gramEnd"/>
-      <w:r>
-        <w:t xml:space="preserve"> is implied to be important in pre-pro-insulin translation, however the specific pathway is not known and thus not included here.</w:t>
+        <w:t>Sec62-depndent SRP recognition also exists, and is implied to be important in pre-pro-insulin translation, however the specific pathway is not known and thus not included here.</w:t>
       </w:r>
     </w:p>
     <w:p>
@@ -70,13 +52,8 @@
         </w:numPr>
       </w:pPr>
       <w:r>
-        <w:t xml:space="preserve">The evidence for SEC24B’s involvement in pro-insulin trafficking is somewhat </w:t>
-      </w:r>
-      <w:proofErr w:type="gramStart"/>
-      <w:r>
-        <w:t>limited</w:t>
-      </w:r>
-      <w:proofErr w:type="gramEnd"/>
+        <w:t>The evidence for SEC24B’s involvement in pro-insulin trafficking is somewhat limited</w:t>
+      </w:r>
     </w:p>
     <w:p>
       <w:pPr>
@@ -102,15 +79,7 @@
         </w:numPr>
       </w:pPr>
       <w:r>
-        <w:t xml:space="preserve">SEC31B has low RNA expression (but potentially high protein-to-RNA ratio) in pancreatic islet cells. In </w:t>
-      </w:r>
-      <w:proofErr w:type="gramStart"/>
-      <w:r>
-        <w:t>addition</w:t>
-      </w:r>
-      <w:proofErr w:type="gramEnd"/>
-      <w:r>
-        <w:t xml:space="preserve"> the evidence for whether SEC31A or B (or both) are involved is missing (both are included in an OR rule for now)</w:t>
+        <w:t>SEC31B has low RNA expression (but potentially high protein-to-RNA ratio) in pancreatic islet cells. In addition the evidence for whether SEC31A or B (or both) are involved is missing (both are included in an OR rule for now)</w:t>
       </w:r>
     </w:p>
     <w:p>
@@ -143,15 +112,7 @@
         </w:numPr>
       </w:pPr>
       <w:r>
-        <w:t xml:space="preserve">Is utilizing base </w:t>
-      </w:r>
-      <w:proofErr w:type="spellStart"/>
-      <w:r>
-        <w:t>clathrin</w:t>
-      </w:r>
-      <w:proofErr w:type="spellEnd"/>
-      <w:r>
-        <w:t xml:space="preserve">-mediated transport with AP-1 mu1 adapters, in addition to: </w:t>
+        <w:t xml:space="preserve">Is utilizing base clathrin-mediated transport with AP-1 mu1 adapters, in addition to: </w:t>
       </w:r>
       <w:r>
         <w:t>CHG, VGF, PTPRN2, SGC3, ARF1, PICK1, ICA1</w:t>
@@ -166,15 +127,7 @@
         </w:numPr>
       </w:pPr>
       <w:r>
-        <w:t xml:space="preserve">Chromogranin A and B are most likely </w:t>
-      </w:r>
-      <w:proofErr w:type="gramStart"/>
-      <w:r>
-        <w:t>paralogs, but</w:t>
-      </w:r>
-      <w:proofErr w:type="gramEnd"/>
-      <w:r>
-        <w:t xml:space="preserve"> form together in granules. This might be further elucidated as the evidence is a little scarce.</w:t>
+        <w:t>Chromogranin A and B are most likely paralogs, but form together in granules. This might be further elucidated as the evidence is a little scarce.</w:t>
       </w:r>
     </w:p>
     <w:p>
@@ -189,13 +142,8 @@
         <w:t>AP-1 mu1 also (according to STRING) interacts with 2 additional subunits G2 and S3, which weren’t mentioned in the canonical AP1</w:t>
       </w:r>
       <w:r>
-        <w:t xml:space="preserve"> subunits, but might with further searching also be involved in pro-insulin trafficking to the stress </w:t>
-      </w:r>
-      <w:proofErr w:type="gramStart"/>
-      <w:r>
-        <w:t>granules</w:t>
-      </w:r>
-      <w:proofErr w:type="gramEnd"/>
+        <w:t xml:space="preserve"> subunits, but might with further searching also be involved in pro-insulin trafficking to the stress granules</w:t>
+      </w:r>
     </w:p>
     <w:p>
       <w:pPr>
@@ -206,13 +154,8 @@
         </w:numPr>
       </w:pPr>
       <w:r>
-        <w:t xml:space="preserve">Compartment stress granule [s] has been added in this </w:t>
-      </w:r>
-      <w:proofErr w:type="gramStart"/>
-      <w:r>
-        <w:t>task</w:t>
-      </w:r>
-      <w:proofErr w:type="gramEnd"/>
+        <w:t>Compartment stress granule [s] has been added in this task</w:t>
+      </w:r>
     </w:p>
     <w:p>
       <w:pPr>
@@ -223,21 +166,8 @@
         </w:numPr>
       </w:pPr>
       <w:r>
-        <w:t xml:space="preserve">Conversion from 65-55 and 32-33 pro-insulin to insulin and C-peptide is written as two lumped reactions; </w:t>
-      </w:r>
-      <w:proofErr w:type="gramStart"/>
-      <w:r>
-        <w:t>in actuality it</w:t>
-      </w:r>
-      <w:proofErr w:type="gramEnd"/>
-      <w:r>
-        <w:t xml:space="preserve"> is first conversion to a des-65 or des-32 version, catalyzed by CPE, then cleaved by PC1 or PC2 together with CPE. Due to the fact that CPE would be in both reactions, and this would create some odd allocation as CPE would then be split over CPE, CPE+PC1, and CPE+</w:t>
-      </w:r>
-      <w:proofErr w:type="gramStart"/>
-      <w:r>
-        <w:t>PC2</w:t>
-      </w:r>
-      <w:proofErr w:type="gramEnd"/>
+        <w:t>It is not entirely clear whether PC2’s dependence on 7B2 is the case for first PC2 reaction, or also for the PC2 +CPE reaction.</w:t>
+      </w:r>
     </w:p>
     <w:p>
       <w:pPr>
@@ -248,7 +178,10 @@
         </w:numPr>
       </w:pPr>
       <w:r>
-        <w:t>It is not entirely clear whether PC2’s dependence on 7B2 is the case for first PC2 reaction, or also for the PC2 +CPE reaction.</w:t>
+        <w:t xml:space="preserve">It also somewhat unclear what pro-insulin-dimerization actually means, as it appears that some articles indicate </w:t>
+      </w:r>
+      <w:r>
+        <w:t>that it is the hetero/homo dimerization of 2 beta chains of separate pro-insulin molecules.</w:t>
       </w:r>
     </w:p>
     <w:p>
@@ -260,70 +193,42 @@
         </w:numPr>
       </w:pPr>
       <w:r>
-        <w:t xml:space="preserve">It also somewhat unclear what pro-insulin-dimerization </w:t>
-      </w:r>
-      <w:proofErr w:type="gramStart"/>
-      <w:r>
-        <w:t>actually means</w:t>
-      </w:r>
-      <w:proofErr w:type="gramEnd"/>
-      <w:r>
-        <w:t xml:space="preserve">, as it appears that some articles indicate </w:t>
-      </w:r>
-      <w:r>
-        <w:t>that it is the hetero/homo dimerization of 2 beta chains of separate pro-insulin molecules.</w:t>
-      </w:r>
-    </w:p>
-    <w:p>
-      <w:pPr>
-        <w:pStyle w:val="ListParagraph"/>
-        <w:numPr>
-          <w:ilvl w:val="0"/>
-          <w:numId w:val="2"/>
-        </w:numPr>
-      </w:pPr>
-      <w:r>
-        <w:t>Pro-insulin is o-</w:t>
-      </w:r>
-      <w:proofErr w:type="gramStart"/>
-      <w:r>
-        <w:t>glycosylated,</w:t>
-      </w:r>
-      <w:proofErr w:type="gramEnd"/>
-      <w:r>
-        <w:t xml:space="preserve"> however this was only recently found through mass-spec and no involved enzyme was identified, nor is its function relevant. </w:t>
-      </w:r>
-      <w:proofErr w:type="gramStart"/>
+        <w:t xml:space="preserve">Pro-insulin is o-glycosylated, however this was only recently found through mass-spec and no involved enzyme was identified, nor is its function relevant. </w:t>
+      </w:r>
       <w:r>
         <w:rPr>
           <w:b/>
           <w:bCs/>
         </w:rPr>
-        <w:t>Therefore</w:t>
-      </w:r>
-      <w:proofErr w:type="gramEnd"/>
+        <w:t xml:space="preserve">Therefore </w:t>
+      </w:r>
       <w:r>
         <w:rPr>
           <w:b/>
           <w:bCs/>
         </w:rPr>
-        <w:t xml:space="preserve"> might want to add an </w:t>
-      </w:r>
-      <w:proofErr w:type="spellStart"/>
+        <w:t xml:space="preserve">we added an </w:t>
+      </w:r>
       <w:r>
         <w:rPr>
           <w:b/>
           <w:bCs/>
         </w:rPr>
-        <w:t>orphanless</w:t>
-      </w:r>
-      <w:proofErr w:type="spellEnd"/>
+        <w:t>orphan</w:t>
+      </w:r>
       <w:r>
         <w:rPr>
           <w:b/>
           <w:bCs/>
         </w:rPr>
-        <w:t xml:space="preserve"> reaction with glycosylation </w:t>
+        <w:t xml:space="preserve"> reaction with glycosylation</w:t>
+      </w:r>
+      <w:r>
+        <w:rPr>
+          <w:b/>
+          <w:bCs/>
+        </w:rPr>
+        <w:t xml:space="preserve">, in later research we might want to find the responsible enzyme </w:t>
       </w:r>
       <w:r>
         <w:rPr>
@@ -344,7 +249,7 @@
 </file>
 
 <file path=word/endnotes.xml><?xml version="1.0" encoding="utf-8"?>
-<w:endnotes xmlns:wpc="http://schemas.microsoft.com/office/word/2010/wordprocessingCanvas" xmlns:cx="http://schemas.microsoft.com/office/drawing/2014/chartex" xmlns:cx1="http://schemas.microsoft.com/office/drawing/2015/9/8/chartex" xmlns:cx2="http://schemas.microsoft.com/office/drawing/2015/10/21/chartex" xmlns:cx3="http://schemas.microsoft.com/office/drawing/2016/5/9/chartex" xmlns:cx4="http://schemas.microsoft.com/office/drawing/2016/5/10/chartex" xmlns:cx5="http://schemas.microsoft.com/office/drawing/2016/5/11/chartex" xmlns:cx6="http://schemas.microsoft.com/office/drawing/2016/5/12/chartex" xmlns:cx7="http://schemas.microsoft.com/office/drawing/2016/5/13/chartex" xmlns:cx8="http://schemas.microsoft.com/office/drawing/2016/5/14/chartex" xmlns:mc="http://schemas.openxmlformats.org/markup-compatibility/2006" xmlns:aink="http://schemas.microsoft.com/office/drawing/2016/ink" xmlns:am3d="http://schemas.microsoft.com/office/drawing/2017/model3d" xmlns:o="urn:schemas-microsoft-com:office:office" xmlns:oel="http://schemas.microsoft.com/office/2019/extlst" xmlns:r="http://schemas.openxmlformats.org/officeDocument/2006/relationships" xmlns:m="http://schemas.openxmlformats.org/officeDocument/2006/math" xmlns:v="urn:schemas-microsoft-com:vml" xmlns:wp14="http://schemas.microsoft.com/office/word/2010/wordprocessingDrawing" xmlns:wp="http://schemas.openxmlformats.org/drawingml/2006/wordprocessingDrawing" xmlns:w10="urn:schemas-microsoft-com:office:word" xmlns:w="http://schemas.openxmlformats.org/wordprocessingml/2006/main" xmlns:w14="http://schemas.microsoft.com/office/word/2010/wordml" xmlns:w15="http://schemas.microsoft.com/office/word/2012/wordml" xmlns:w16cex="http://schemas.microsoft.com/office/word/2018/wordml/cex" xmlns:w16cid="http://schemas.microsoft.com/office/word/2016/wordml/cid" xmlns:w16="http://schemas.microsoft.com/office/word/2018/wordml" xmlns:w16du="http://schemas.microsoft.com/office/word/2023/wordml/word16du" xmlns:w16sdtdh="http://schemas.microsoft.com/office/word/2020/wordml/sdtdatahash" xmlns:w16se="http://schemas.microsoft.com/office/word/2015/wordml/symex" xmlns:wpg="http://schemas.microsoft.com/office/word/2010/wordprocessingGroup" xmlns:wpi="http://schemas.microsoft.com/office/word/2010/wordprocessingInk" xmlns:wne="http://schemas.microsoft.com/office/word/2006/wordml" xmlns:wps="http://schemas.microsoft.com/office/word/2010/wordprocessingShape" mc:Ignorable="w14 w15 w16se w16cid w16 w16cex w16sdtdh w16du wp14">
+<w:endnotes xmlns:wpc="http://schemas.microsoft.com/office/word/2010/wordprocessingCanvas" xmlns:cx="http://schemas.microsoft.com/office/drawing/2014/chartex" xmlns:cx1="http://schemas.microsoft.com/office/drawing/2015/9/8/chartex" xmlns:cx2="http://schemas.microsoft.com/office/drawing/2015/10/21/chartex" xmlns:cx3="http://schemas.microsoft.com/office/drawing/2016/5/9/chartex" xmlns:cx4="http://schemas.microsoft.com/office/drawing/2016/5/10/chartex" xmlns:cx5="http://schemas.microsoft.com/office/drawing/2016/5/11/chartex" xmlns:cx6="http://schemas.microsoft.com/office/drawing/2016/5/12/chartex" xmlns:cx7="http://schemas.microsoft.com/office/drawing/2016/5/13/chartex" xmlns:cx8="http://schemas.microsoft.com/office/drawing/2016/5/14/chartex" xmlns:mc="http://schemas.openxmlformats.org/markup-compatibility/2006" xmlns:aink="http://schemas.microsoft.com/office/drawing/2016/ink" xmlns:am3d="http://schemas.microsoft.com/office/drawing/2017/model3d" xmlns:o="urn:schemas-microsoft-com:office:office" xmlns:oel="http://schemas.microsoft.com/office/2019/extlst" xmlns:r="http://schemas.openxmlformats.org/officeDocument/2006/relationships" xmlns:m="http://schemas.openxmlformats.org/officeDocument/2006/math" xmlns:v="urn:schemas-microsoft-com:vml" xmlns:wp14="http://schemas.microsoft.com/office/word/2010/wordprocessingDrawing" xmlns:wp="http://schemas.openxmlformats.org/drawingml/2006/wordprocessingDrawing" xmlns:w10="urn:schemas-microsoft-com:office:word" xmlns:w="http://schemas.openxmlformats.org/wordprocessingml/2006/main" xmlns:w14="http://schemas.microsoft.com/office/word/2010/wordml" xmlns:w15="http://schemas.microsoft.com/office/word/2012/wordml" xmlns:w16cex="http://schemas.microsoft.com/office/word/2018/wordml/cex" xmlns:w16cid="http://schemas.microsoft.com/office/word/2016/wordml/cid" xmlns:w16="http://schemas.microsoft.com/office/word/2018/wordml" xmlns:w16du="http://schemas.microsoft.com/office/word/2023/wordml/word16du" xmlns:w16sdtdh="http://schemas.microsoft.com/office/word/2020/wordml/sdtdatahash" xmlns:w16sdtfl="http://schemas.microsoft.com/office/word/2024/wordml/sdtformatlock" xmlns:w16se="http://schemas.microsoft.com/office/word/2015/wordml/symex" xmlns:wpg="http://schemas.microsoft.com/office/word/2010/wordprocessingGroup" xmlns:wpi="http://schemas.microsoft.com/office/word/2010/wordprocessingInk" xmlns:wne="http://schemas.microsoft.com/office/word/2006/wordml" xmlns:wps="http://schemas.microsoft.com/office/word/2010/wordprocessingShape" mc:Ignorable="w14 w15 w16se w16cid w16 w16cex w16sdtdh w16sdtfl w16du wp14">
   <w:endnote w:type="separator" w:id="-1">
     <w:p>
       <w:pPr>
@@ -369,7 +274,7 @@
 </file>
 
 <file path=word/footnotes.xml><?xml version="1.0" encoding="utf-8"?>
-<w:footnotes xmlns:wpc="http://schemas.microsoft.com/office/word/2010/wordprocessingCanvas" xmlns:cx="http://schemas.microsoft.com/office/drawing/2014/chartex" xmlns:cx1="http://schemas.microsoft.com/office/drawing/2015/9/8/chartex" xmlns:cx2="http://schemas.microsoft.com/office/drawing/2015/10/21/chartex" xmlns:cx3="http://schemas.microsoft.com/office/drawing/2016/5/9/chartex" xmlns:cx4="http://schemas.microsoft.com/office/drawing/2016/5/10/chartex" xmlns:cx5="http://schemas.microsoft.com/office/drawing/2016/5/11/chartex" xmlns:cx6="http://schemas.microsoft.com/office/drawing/2016/5/12/chartex" xmlns:cx7="http://schemas.microsoft.com/office/drawing/2016/5/13/chartex" xmlns:cx8="http://schemas.microsoft.com/office/drawing/2016/5/14/chartex" xmlns:mc="http://schemas.openxmlformats.org/markup-compatibility/2006" xmlns:aink="http://schemas.microsoft.com/office/drawing/2016/ink" xmlns:am3d="http://schemas.microsoft.com/office/drawing/2017/model3d" xmlns:o="urn:schemas-microsoft-com:office:office" xmlns:oel="http://schemas.microsoft.com/office/2019/extlst" xmlns:r="http://schemas.openxmlformats.org/officeDocument/2006/relationships" xmlns:m="http://schemas.openxmlformats.org/officeDocument/2006/math" xmlns:v="urn:schemas-microsoft-com:vml" xmlns:wp14="http://schemas.microsoft.com/office/word/2010/wordprocessingDrawing" xmlns:wp="http://schemas.openxmlformats.org/drawingml/2006/wordprocessingDrawing" xmlns:w10="urn:schemas-microsoft-com:office:word" xmlns:w="http://schemas.openxmlformats.org/wordprocessingml/2006/main" xmlns:w14="http://schemas.microsoft.com/office/word/2010/wordml" xmlns:w15="http://schemas.microsoft.com/office/word/2012/wordml" xmlns:w16cex="http://schemas.microsoft.com/office/word/2018/wordml/cex" xmlns:w16cid="http://schemas.microsoft.com/office/word/2016/wordml/cid" xmlns:w16="http://schemas.microsoft.com/office/word/2018/wordml" xmlns:w16du="http://schemas.microsoft.com/office/word/2023/wordml/word16du" xmlns:w16sdtdh="http://schemas.microsoft.com/office/word/2020/wordml/sdtdatahash" xmlns:w16se="http://schemas.microsoft.com/office/word/2015/wordml/symex" xmlns:wpg="http://schemas.microsoft.com/office/word/2010/wordprocessingGroup" xmlns:wpi="http://schemas.microsoft.com/office/word/2010/wordprocessingInk" xmlns:wne="http://schemas.microsoft.com/office/word/2006/wordml" xmlns:wps="http://schemas.microsoft.com/office/word/2010/wordprocessingShape" mc:Ignorable="w14 w15 w16se w16cid w16 w16cex w16sdtdh w16du wp14">
+<w:footnotes xmlns:wpc="http://schemas.microsoft.com/office/word/2010/wordprocessingCanvas" xmlns:cx="http://schemas.microsoft.com/office/drawing/2014/chartex" xmlns:cx1="http://schemas.microsoft.com/office/drawing/2015/9/8/chartex" xmlns:cx2="http://schemas.microsoft.com/office/drawing/2015/10/21/chartex" xmlns:cx3="http://schemas.microsoft.com/office/drawing/2016/5/9/chartex" xmlns:cx4="http://schemas.microsoft.com/office/drawing/2016/5/10/chartex" xmlns:cx5="http://schemas.microsoft.com/office/drawing/2016/5/11/chartex" xmlns:cx6="http://schemas.microsoft.com/office/drawing/2016/5/12/chartex" xmlns:cx7="http://schemas.microsoft.com/office/drawing/2016/5/13/chartex" xmlns:cx8="http://schemas.microsoft.com/office/drawing/2016/5/14/chartex" xmlns:mc="http://schemas.openxmlformats.org/markup-compatibility/2006" xmlns:aink="http://schemas.microsoft.com/office/drawing/2016/ink" xmlns:am3d="http://schemas.microsoft.com/office/drawing/2017/model3d" xmlns:o="urn:schemas-microsoft-com:office:office" xmlns:oel="http://schemas.microsoft.com/office/2019/extlst" xmlns:r="http://schemas.openxmlformats.org/officeDocument/2006/relationships" xmlns:m="http://schemas.openxmlformats.org/officeDocument/2006/math" xmlns:v="urn:schemas-microsoft-com:vml" xmlns:wp14="http://schemas.microsoft.com/office/word/2010/wordprocessingDrawing" xmlns:wp="http://schemas.openxmlformats.org/drawingml/2006/wordprocessingDrawing" xmlns:w10="urn:schemas-microsoft-com:office:word" xmlns:w="http://schemas.openxmlformats.org/wordprocessingml/2006/main" xmlns:w14="http://schemas.microsoft.com/office/word/2010/wordml" xmlns:w15="http://schemas.microsoft.com/office/word/2012/wordml" xmlns:w16cex="http://schemas.microsoft.com/office/word/2018/wordml/cex" xmlns:w16cid="http://schemas.microsoft.com/office/word/2016/wordml/cid" xmlns:w16="http://schemas.microsoft.com/office/word/2018/wordml" xmlns:w16du="http://schemas.microsoft.com/office/word/2023/wordml/word16du" xmlns:w16sdtdh="http://schemas.microsoft.com/office/word/2020/wordml/sdtdatahash" xmlns:w16sdtfl="http://schemas.microsoft.com/office/word/2024/wordml/sdtformatlock" xmlns:w16se="http://schemas.microsoft.com/office/word/2015/wordml/symex" xmlns:wpg="http://schemas.microsoft.com/office/word/2010/wordprocessingGroup" xmlns:wpi="http://schemas.microsoft.com/office/word/2010/wordprocessingInk" xmlns:wne="http://schemas.microsoft.com/office/word/2006/wordml" xmlns:wps="http://schemas.microsoft.com/office/word/2010/wordprocessingShape" mc:Ignorable="w14 w15 w16se w16cid w16 w16cex w16sdtdh w16sdtfl w16du wp14">
   <w:footnote w:type="separator" w:id="-1">
     <w:p>
       <w:pPr>
@@ -394,7 +299,7 @@
 </file>
 
 <file path=word/numbering.xml><?xml version="1.0" encoding="utf-8"?>
-<w:numbering xmlns:wpc="http://schemas.microsoft.com/office/word/2010/wordprocessingCanvas" xmlns:cx="http://schemas.microsoft.com/office/drawing/2014/chartex" xmlns:cx1="http://schemas.microsoft.com/office/drawing/2015/9/8/chartex" xmlns:cx2="http://schemas.microsoft.com/office/drawing/2015/10/21/chartex" xmlns:cx3="http://schemas.microsoft.com/office/drawing/2016/5/9/chartex" xmlns:cx4="http://schemas.microsoft.com/office/drawing/2016/5/10/chartex" xmlns:cx5="http://schemas.microsoft.com/office/drawing/2016/5/11/chartex" xmlns:cx6="http://schemas.microsoft.com/office/drawing/2016/5/12/chartex" xmlns:cx7="http://schemas.microsoft.com/office/drawing/2016/5/13/chartex" xmlns:cx8="http://schemas.microsoft.com/office/drawing/2016/5/14/chartex" xmlns:mc="http://schemas.openxmlformats.org/markup-compatibility/2006" xmlns:aink="http://schemas.microsoft.com/office/drawing/2016/ink" xmlns:am3d="http://schemas.microsoft.com/office/drawing/2017/model3d" xmlns:o="urn:schemas-microsoft-com:office:office" xmlns:oel="http://schemas.microsoft.com/office/2019/extlst" xmlns:r="http://schemas.openxmlformats.org/officeDocument/2006/relationships" xmlns:m="http://schemas.openxmlformats.org/officeDocument/2006/math" xmlns:v="urn:schemas-microsoft-com:vml" xmlns:wp14="http://schemas.microsoft.com/office/word/2010/wordprocessingDrawing" xmlns:wp="http://schemas.openxmlformats.org/drawingml/2006/wordprocessingDrawing" xmlns:w10="urn:schemas-microsoft-com:office:word" xmlns:w="http://schemas.openxmlformats.org/wordprocessingml/2006/main" xmlns:w14="http://schemas.microsoft.com/office/word/2010/wordml" xmlns:w15="http://schemas.microsoft.com/office/word/2012/wordml" xmlns:w16cex="http://schemas.microsoft.com/office/word/2018/wordml/cex" xmlns:w16cid="http://schemas.microsoft.com/office/word/2016/wordml/cid" xmlns:w16="http://schemas.microsoft.com/office/word/2018/wordml" xmlns:w16du="http://schemas.microsoft.com/office/word/2023/wordml/word16du" xmlns:w16sdtdh="http://schemas.microsoft.com/office/word/2020/wordml/sdtdatahash" xmlns:w16se="http://schemas.microsoft.com/office/word/2015/wordml/symex" xmlns:wpg="http://schemas.microsoft.com/office/word/2010/wordprocessingGroup" xmlns:wpi="http://schemas.microsoft.com/office/word/2010/wordprocessingInk" xmlns:wne="http://schemas.microsoft.com/office/word/2006/wordml" xmlns:wps="http://schemas.microsoft.com/office/word/2010/wordprocessingShape" mc:Ignorable="w14 w15 w16se w16cid w16 w16cex w16sdtdh w16du wp14">
+<w:numbering xmlns:wpc="http://schemas.microsoft.com/office/word/2010/wordprocessingCanvas" xmlns:cx="http://schemas.microsoft.com/office/drawing/2014/chartex" xmlns:cx1="http://schemas.microsoft.com/office/drawing/2015/9/8/chartex" xmlns:cx2="http://schemas.microsoft.com/office/drawing/2015/10/21/chartex" xmlns:cx3="http://schemas.microsoft.com/office/drawing/2016/5/9/chartex" xmlns:cx4="http://schemas.microsoft.com/office/drawing/2016/5/10/chartex" xmlns:cx5="http://schemas.microsoft.com/office/drawing/2016/5/11/chartex" xmlns:cx6="http://schemas.microsoft.com/office/drawing/2016/5/12/chartex" xmlns:cx7="http://schemas.microsoft.com/office/drawing/2016/5/13/chartex" xmlns:cx8="http://schemas.microsoft.com/office/drawing/2016/5/14/chartex" xmlns:mc="http://schemas.openxmlformats.org/markup-compatibility/2006" xmlns:aink="http://schemas.microsoft.com/office/drawing/2016/ink" xmlns:am3d="http://schemas.microsoft.com/office/drawing/2017/model3d" xmlns:o="urn:schemas-microsoft-com:office:office" xmlns:oel="http://schemas.microsoft.com/office/2019/extlst" xmlns:r="http://schemas.openxmlformats.org/officeDocument/2006/relationships" xmlns:m="http://schemas.openxmlformats.org/officeDocument/2006/math" xmlns:v="urn:schemas-microsoft-com:vml" xmlns:wp14="http://schemas.microsoft.com/office/word/2010/wordprocessingDrawing" xmlns:wp="http://schemas.openxmlformats.org/drawingml/2006/wordprocessingDrawing" xmlns:w10="urn:schemas-microsoft-com:office:word" xmlns:w="http://schemas.openxmlformats.org/wordprocessingml/2006/main" xmlns:w14="http://schemas.microsoft.com/office/word/2010/wordml" xmlns:w15="http://schemas.microsoft.com/office/word/2012/wordml" xmlns:w16cex="http://schemas.microsoft.com/office/word/2018/wordml/cex" xmlns:w16cid="http://schemas.microsoft.com/office/word/2016/wordml/cid" xmlns:w16="http://schemas.microsoft.com/office/word/2018/wordml" xmlns:w16du="http://schemas.microsoft.com/office/word/2023/wordml/word16du" xmlns:w16sdtdh="http://schemas.microsoft.com/office/word/2020/wordml/sdtdatahash" xmlns:w16sdtfl="http://schemas.microsoft.com/office/word/2024/wordml/sdtformatlock" xmlns:w16se="http://schemas.microsoft.com/office/word/2015/wordml/symex" xmlns:wpg="http://schemas.microsoft.com/office/word/2010/wordprocessingGroup" xmlns:wpi="http://schemas.microsoft.com/office/word/2010/wordprocessingInk" xmlns:wne="http://schemas.microsoft.com/office/word/2006/wordml" xmlns:wps="http://schemas.microsoft.com/office/word/2010/wordprocessingShape" mc:Ignorable="w14 w15 w16se w16cid w16 w16cex w16sdtdh w16sdtfl w16du wp14">
   <w:abstractNum w:abstractNumId="0" w15:restartNumberingAfterBreak="0">
     <w:nsid w:val="18011EEB"/>
     <w:multiLevelType w:val="hybridMultilevel"/>
@@ -629,7 +534,7 @@
 </file>
 
 <file path=word/styles.xml><?xml version="1.0" encoding="utf-8"?>
-<w:styles xmlns:mc="http://schemas.openxmlformats.org/markup-compatibility/2006" xmlns:r="http://schemas.openxmlformats.org/officeDocument/2006/relationships" xmlns:w="http://schemas.openxmlformats.org/wordprocessingml/2006/main" xmlns:w14="http://schemas.microsoft.com/office/word/2010/wordml" xmlns:w15="http://schemas.microsoft.com/office/word/2012/wordml" xmlns:w16cex="http://schemas.microsoft.com/office/word/2018/wordml/cex" xmlns:w16cid="http://schemas.microsoft.com/office/word/2016/wordml/cid" xmlns:w16="http://schemas.microsoft.com/office/word/2018/wordml" xmlns:w16du="http://schemas.microsoft.com/office/word/2023/wordml/word16du" xmlns:w16sdtdh="http://schemas.microsoft.com/office/word/2020/wordml/sdtdatahash" xmlns:w16se="http://schemas.microsoft.com/office/word/2015/wordml/symex" mc:Ignorable="w14 w15 w16se w16cid w16 w16cex w16sdtdh w16du">
+<w:styles xmlns:mc="http://schemas.openxmlformats.org/markup-compatibility/2006" xmlns:r="http://schemas.openxmlformats.org/officeDocument/2006/relationships" xmlns:w="http://schemas.openxmlformats.org/wordprocessingml/2006/main" xmlns:w14="http://schemas.microsoft.com/office/word/2010/wordml" xmlns:w15="http://schemas.microsoft.com/office/word/2012/wordml" xmlns:w16cex="http://schemas.microsoft.com/office/word/2018/wordml/cex" xmlns:w16cid="http://schemas.microsoft.com/office/word/2016/wordml/cid" xmlns:w16="http://schemas.microsoft.com/office/word/2018/wordml" xmlns:w16du="http://schemas.microsoft.com/office/word/2023/wordml/word16du" xmlns:w16sdtdh="http://schemas.microsoft.com/office/word/2020/wordml/sdtdatahash" xmlns:w16sdtfl="http://schemas.microsoft.com/office/word/2024/wordml/sdtformatlock" xmlns:w16se="http://schemas.microsoft.com/office/word/2015/wordml/symex" mc:Ignorable="w14 w15 w16se w16cid w16 w16cex w16sdtdh w16sdtfl w16du">
   <w:docDefaults>
     <w:rPrDefault>
       <w:rPr>

</xml_diff>